<commit_message>
docs: remove project number from two-page case study
</commit_message>
<xml_diff>
--- a/docs/case-study.docx
+++ b/docs/case-study.docx
@@ -4,13 +4,7 @@
   <w:body>
     <w:p>
       <w:r>
-        <w:rPr>
-          <w:b/>
-        </w:rPr>
-        <w:t>PROJECT 02</w:t>
-      </w:r>
-      <w:r>
-        <w:t xml:space="preserve">  /  DIRECT-TO-CHIP LIQUID COOLING</w:t>
+        <w:t>DIRECT-TO-CHIP LIQUID COOLING</w:t>
       </w:r>
     </w:p>
     <w:p>

</xml_diff>